<commit_message>
Actualiza la guía: el repositorio pasa a ser público
</commit_message>
<xml_diff>
--- a/Guia-de-uso-skills-RMEI-digital.docx
+++ b/Guia-de-uso-skills-RMEI-digital.docx
@@ -123,7 +123,7 @@
           <w:szCs w:val="24"/>
           <w:lang w:val="es-419"/>
         </w:rPr>
-        <w:t xml:space="preserve">1.10.1</w:t>
+        <w:t xml:space="preserve">1.10.2</w:t>
       </w:r>
     </w:p>
     <w:p>
@@ -153,7 +153,7 @@
           <w:szCs w:val="24"/>
           <w:lang w:val="es-419"/>
         </w:rPr>
-        <w:t xml:space="preserve">3 de septiembre de 2026</w:t>
+        <w:t xml:space="preserve">4 de septiembre de 2026</w:t>
       </w:r>
     </w:p>
     <w:p>
@@ -895,22 +895,31 @@
       <w:r>
         <w:rPr>
           <w:rFonts w:ascii="Calibri" w:hAnsi="Calibri" w:cs="Calibri"/>
+          <w:sz w:val="24"/>
+          <w:szCs w:val="24"/>
+          <w:lang w:val="es-419"/>
+        </w:rPr>
+        <w:t xml:space="preserve">El repositorio es </w:t>
+      </w:r>
+      <w:r>
+        <w:rPr>
+          <w:rFonts w:ascii="Calibri" w:hAnsi="Calibri" w:cs="Calibri"/>
           <w:b/>
           <w:bCs/>
           <w:sz w:val="24"/>
           <w:szCs w:val="24"/>
           <w:lang w:val="es-419"/>
         </w:rPr>
-        <w:t xml:space="preserve">Si el primer comando falla</w:t>
-      </w:r>
-      <w:r>
-        <w:rPr>
-          <w:rFonts w:ascii="Calibri" w:hAnsi="Calibri" w:cs="Calibri"/>
-          <w:sz w:val="24"/>
-          <w:szCs w:val="24"/>
-          <w:lang w:val="es-419"/>
-        </w:rPr>
-        <w:t xml:space="preserve">, casi siempre es lo mismo: el repositorio es privado y tu git no sabe autenticarse con GitHub. Corre gh auth login, contesta las preguntas que hace, y vuelve a intentarlo.</w:t>
+        <w:t xml:space="preserve">público</w:t>
+      </w:r>
+      <w:r>
+        <w:rPr>
+          <w:rFonts w:ascii="Calibri" w:hAnsi="Calibri" w:cs="Calibri"/>
+          <w:sz w:val="24"/>
+          <w:szCs w:val="24"/>
+          <w:lang w:val="es-419"/>
+        </w:rPr>
+        <w:t xml:space="preserve">: no hace falta cuenta de GitHub ni autenticarse para instalarlo. Si el primer comando falla, suele ser que tu git no puede salir a internet (el proxy o la VPN de la oficina), y el plan B de abajo sirve igual para ese caso.</w:t>
       </w:r>
     </w:p>
     <w:p>
@@ -1061,7 +1070,7 @@
           <w:szCs w:val="24"/>
           <w:lang w:val="es-419"/>
         </w:rPr>
-        <w:t xml:space="preserve"> En Customize (Personalizar) &gt; Plugins, elige «Add marketplace», escribe RMEI-digital/claude-skills e instala el plugin irem. Para traer los cambios que se publiquen después, el botón «Update» del marketplace. Como el repositorio es privado, tu cuenta de GitHub tiene que poder verlo; si no aparece, pasa al camino 2.</w:t>
+        <w:t xml:space="preserve"> En Customize (Personalizar) &gt; Plugins, elige «Add marketplace», escribe RMEI-digital/claude-skills e instala el plugin irem. Para traer los cambios que se publiquen después, el botón «Update» del marketplace. El repositorio es público, así que no necesitas conectar tu cuenta de GitHub ni que tu organización tenga habilitado el conector de GitHub. Si aun así no aparece, pasa al camino 2.</w:t>
       </w:r>
     </w:p>
     <w:p>
@@ -1104,7 +1113,7 @@
           <w:szCs w:val="24"/>
           <w:lang w:val="es-419"/>
         </w:rPr>
-        <w:t xml:space="preserve"> En GitHub, con la sesión iniciada, el botón verde «Code» y «Download ZIP». Descomprime, entra en la carpeta plugins, comprime la carpeta irem (clic derecho, «Comprimir») y sube ese .zip en Customize &gt; Plugins, con la opción de instalar desde archivo. Suben las cinco skills de una vez.</w:t>
+        <w:t xml:space="preserve"> En GitHub, el botón verde «Code» y «Download ZIP», sin necesidad de cuenta. Descomprime, entra en la carpeta plugins, comprime la carpeta irem (clic derecho, «Comprimir») y sube ese .zip en Customize &gt; Plugins, con la opción de instalar desde archivo. Suben las cinco skills de una vez.</w:t>
       </w:r>
     </w:p>
     <w:p>
@@ -3919,6 +3928,89 @@
           <w:lang w:val="es-419"/>
         </w:rPr>
         <w:t xml:space="preserve"> de cada regla importa más que la regla: es lo que evita que alguien la deshaga sin saber qué rompía. Y al publicar hay que subir la versión del plugin: el comando de actualización compara versiones, no contenido, así que sin ese número el equipo se queda con la copia vieja y sin ningún aviso.</w:t>
+      </w:r>
+    </w:p>
+    <w:p>
+      <w:pPr>
+        <w:rPr>
+          <w:rFonts w:ascii="Calibri" w:hAnsi="Calibri" w:cs="Calibri"/>
+          <w:sz w:val="24"/>
+          <w:szCs w:val="24"/>
+          <w:lang w:val="es-419"/>
+        </w:rPr>
+      </w:pPr>
+    </w:p>
+    <w:p>
+      <w:pPr>
+        <w:keepNext/>
+        <w:pStyle w:val="NormalWeb"/>
+        <w:numPr>
+          <w:ilvl w:val="0"/>
+          <w:numId w:val="53"/>
+        </w:numPr>
+        <w:spacing w:before="0" w:beforeAutospacing="0" w:after="0" w:afterAutospacing="0"/>
+        <w:ind w:left="540" w:hanging="270"/>
+        <w:rPr>
+          <w:rFonts w:ascii="Calibri" w:hAnsi="Calibri" w:cs="Calibri"/>
+          <w:b/>
+          <w:bCs/>
+          <w:sz w:val="24"/>
+          <w:szCs w:val="24"/>
+          <w:lang w:val="es-419"/>
+        </w:rPr>
+      </w:pPr>
+      <w:r>
+        <w:rPr>
+          <w:rFonts w:ascii="Calibri" w:hAnsi="Calibri" w:cs="Calibri"/>
+          <w:b/>
+          <w:bCs/>
+          <w:sz w:val="24"/>
+          <w:szCs w:val="24"/>
+          <w:lang w:val="es-419"/>
+        </w:rPr>
+        <w:t xml:space="preserve">Licencia</w:t>
+      </w:r>
+    </w:p>
+    <w:p>
+      <w:pPr>
+        <w:pStyle w:val="NormalWeb"/>
+        <w:spacing w:before="0" w:beforeAutospacing="0" w:after="0" w:afterAutospacing="0"/>
+        <w:jc w:val="both"/>
+        <w:rPr>
+          <w:rFonts w:ascii="Calibri" w:hAnsi="Calibri" w:cs="Calibri"/>
+          <w:sz w:val="24"/>
+          <w:szCs w:val="24"/>
+          <w:lang w:val="es-419"/>
+        </w:rPr>
+      </w:pPr>
+      <w:r>
+        <w:rPr>
+          <w:rFonts w:ascii="Calibri" w:hAnsi="Calibri" w:cs="Calibri"/>
+          <w:sz w:val="24"/>
+          <w:szCs w:val="24"/>
+          <w:lang w:val="es-419"/>
+        </w:rPr>
+        <w:t xml:space="preserve">Las skills, las plantillas y los scripts se publican bajo Creative Commons Atribución 4.0 (CC BY 4.0): cualquiera puede usarlos y adaptarlos, incluso comercialmente, citando a la IREM. Quedan </w:t>
+      </w:r>
+      <w:r>
+        <w:rPr>
+          <w:rFonts w:ascii="Calibri" w:hAnsi="Calibri" w:cs="Calibri"/>
+          <w:b/>
+          <w:bCs/>
+          <w:sz w:val="24"/>
+          <w:szCs w:val="24"/>
+          <w:lang w:val="es-419"/>
+        </w:rPr>
+        <w:t xml:space="preserve">fuera</w:t>
+      </w:r>
+      <w:r>
+        <w:rPr>
+          <w:rFonts w:ascii="Calibri" w:hAnsi="Calibri" w:cs="Calibri"/>
+          <w:sz w:val="24"/>
+          <w:szCs w:val="24"/>
+          <w:lang w:val="es-419"/>
+        </w:rPr>
+        <w:t xml:space="preserve"> los logotipos institucionales y la fotografía de portada de las presentaciones, que pertenecen a sus titulares; si adaptas estas plantillas para otra organización, sustitúyelos por los tuyos. El detalle está en el archivo LICENSE del repositorio.</w:t>
       </w:r>
     </w:p>
     <w:sectPr>

</xml_diff>

<commit_message>
Documenta la skill de agendas y cómo actualizar (v1.11.1)
</commit_message>
<xml_diff>
--- a/Guia-de-uso-skills-RMEI-digital.docx
+++ b/Guia-de-uso-skills-RMEI-digital.docx
@@ -123,7 +123,7 @@
           <w:szCs w:val="24"/>
           <w:lang w:val="es-419"/>
         </w:rPr>
-        <w:t xml:space="preserve">1.10.2</w:t>
+        <w:t xml:space="preserve">1.11.1</w:t>
       </w:r>
     </w:p>
     <w:p>
@@ -153,7 +153,7 @@
           <w:szCs w:val="24"/>
           <w:lang w:val="es-419"/>
         </w:rPr>
-        <w:t xml:space="preserve">4 de septiembre de 2026</w:t>
+        <w:t xml:space="preserve">8 de septiembre de 2026</w:t>
       </w:r>
     </w:p>
     <w:p>
@@ -175,7 +175,7 @@
           <w:numId w:val="53"/>
         </w:numPr>
         <w:spacing w:before="0" w:beforeAutospacing="0" w:after="0" w:afterAutospacing="0"/>
-        <w:ind w:left="540" w:hanging="270"/>
+        <w:ind w:left="0" w:hanging="0"/>
         <w:rPr>
           <w:rFonts w:ascii="Calibri" w:hAnsi="Calibri" w:cs="Calibri"/>
           <w:b/>
@@ -270,6 +270,7 @@
           <w:tcPr>
             <w:tcW w:w="2543" w:type="dxa"/>
             <w:shd w:val="clear" w:color="auto" w:fill="D9D9D9"/>
+            <w:vAlign w:val="center"/>
           </w:tcPr>
           <w:p>
             <w:pPr>
@@ -304,6 +305,7 @@
           <w:tcPr>
             <w:tcW w:w="7241" w:type="dxa"/>
             <w:shd w:val="clear" w:color="auto" w:fill="D9D9D9"/>
+            <w:vAlign w:val="center"/>
           </w:tcPr>
           <w:p>
             <w:pPr>
@@ -348,7 +350,72 @@
             <w:pPr>
               <w:pStyle w:val="ListParagraph"/>
               <w:ind w:left="0"/>
-              <w:jc w:val="both"/>
+              <w:jc w:val="left"/>
+              <w:rPr>
+                <w:rFonts w:ascii="Calibri" w:hAnsi="Calibri" w:cs="Calibri"/>
+                <w:color w:val="000000"/>
+                <w:sz w:val="22"/>
+                <w:szCs w:val="22"/>
+                <w:lang w:val="es-419"/>
+              </w:rPr>
+            </w:pPr>
+            <w:r>
+              <w:rPr>
+                <w:rFonts w:ascii="Calibri" w:hAnsi="Calibri" w:cs="Calibri"/>
+                <w:color w:val="000000"/>
+                <w:sz w:val="22"/>
+                <w:szCs w:val="22"/>
+                <w:lang w:val="es-419"/>
+              </w:rPr>
+              <w:t xml:space="preserve">/irem-mision-agenda</w:t>
+            </w:r>
+          </w:p>
+        </w:tc>
+        <w:tc>
+          <w:tcPr>
+            <w:tcW w:w="7241" w:type="dxa"/>
+            <w:vAlign w:val="center"/>
+          </w:tcPr>
+          <w:p>
+            <w:pPr>
+              <w:pStyle w:val="ListParagraph"/>
+              <w:ind w:left="0"/>
+              <w:jc w:val="center"/>
+              <w:rPr>
+                <w:rFonts w:ascii="Calibri" w:hAnsi="Calibri" w:cs="Calibri"/>
+                <w:color w:val="000000"/>
+                <w:sz w:val="22"/>
+                <w:szCs w:val="22"/>
+                <w:lang w:val="es-419"/>
+              </w:rPr>
+            </w:pPr>
+            <w:r>
+              <w:rPr>
+                <w:rFonts w:ascii="Calibri" w:hAnsi="Calibri" w:cs="Calibri"/>
+                <w:color w:val="000000"/>
+                <w:sz w:val="22"/>
+                <w:szCs w:val="22"/>
+                <w:lang w:val="es-419"/>
+              </w:rPr>
+              <w:t xml:space="preserve">Redacta la agenda de una misión, sea de definición de alcance, de capacitación o de monitoreo.</w:t>
+            </w:r>
+          </w:p>
+        </w:tc>
+      </w:tr>
+      <w:tr>
+        <w:trPr>
+          <w:jc w:val="center"/>
+        </w:trPr>
+        <w:tc>
+          <w:tcPr>
+            <w:tcW w:w="2543" w:type="dxa"/>
+            <w:vAlign w:val="center"/>
+          </w:tcPr>
+          <w:p>
+            <w:pPr>
+              <w:pStyle w:val="ListParagraph"/>
+              <w:ind w:left="0"/>
+              <w:jc w:val="left"/>
               <w:rPr>
                 <w:rFonts w:ascii="Calibri" w:hAnsi="Calibri" w:cs="Calibri"/>
                 <w:color w:val="000000"/>
@@ -413,7 +480,7 @@
             <w:pPr>
               <w:pStyle w:val="ListParagraph"/>
               <w:ind w:left="0"/>
-              <w:jc w:val="both"/>
+              <w:jc w:val="left"/>
               <w:rPr>
                 <w:rFonts w:ascii="Calibri" w:hAnsi="Calibri" w:cs="Calibri"/>
                 <w:color w:val="000000"/>
@@ -478,7 +545,7 @@
             <w:pPr>
               <w:pStyle w:val="ListParagraph"/>
               <w:ind w:left="0"/>
-              <w:jc w:val="both"/>
+              <w:jc w:val="left"/>
               <w:rPr>
                 <w:rFonts w:ascii="Calibri" w:hAnsi="Calibri" w:cs="Calibri"/>
                 <w:color w:val="000000"/>
@@ -543,7 +610,7 @@
             <w:pPr>
               <w:pStyle w:val="ListParagraph"/>
               <w:ind w:left="0"/>
-              <w:jc w:val="both"/>
+              <w:jc w:val="left"/>
               <w:rPr>
                 <w:rFonts w:ascii="Calibri" w:hAnsi="Calibri" w:cs="Calibri"/>
                 <w:color w:val="000000"/>
@@ -608,7 +675,7 @@
             <w:pPr>
               <w:pStyle w:val="ListParagraph"/>
               <w:ind w:left="0"/>
-              <w:jc w:val="both"/>
+              <w:jc w:val="left"/>
               <w:rPr>
                 <w:rFonts w:ascii="Calibri" w:hAnsi="Calibri" w:cs="Calibri"/>
                 <w:color w:val="000000"/>
@@ -690,7 +757,7 @@
           <w:numId w:val="53"/>
         </w:numPr>
         <w:spacing w:before="0" w:beforeAutospacing="0" w:after="0" w:afterAutospacing="0"/>
-        <w:ind w:left="540" w:hanging="270"/>
+        <w:ind w:left="0" w:hanging="0"/>
         <w:rPr>
           <w:rFonts w:ascii="Calibri" w:hAnsi="Calibri" w:cs="Calibri"/>
           <w:b/>
@@ -867,7 +934,7 @@
           <w:szCs w:val="24"/>
           <w:lang w:val="es-419"/>
         </w:rPr>
-        <w:t xml:space="preserve">. Las instrucciones se cargan al arrancar, así que sin ese paso no aparecen. Al volver deberías ver las cinco skills irem-.</w:t>
+        <w:t xml:space="preserve">. Las instrucciones se cargan al arrancar, así que sin ese paso no aparecen. Al volver deberías ver las seis skills irem-.</w:t>
       </w:r>
     </w:p>
     <w:p>
@@ -1113,7 +1180,7 @@
           <w:szCs w:val="24"/>
           <w:lang w:val="es-419"/>
         </w:rPr>
-        <w:t xml:space="preserve"> En GitHub, el botón verde «Code» y «Download ZIP», sin necesidad de cuenta. Descomprime, entra en la carpeta plugins, comprime la carpeta irem (clic derecho, «Comprimir») y sube ese .zip en Customize &gt; Plugins, con la opción de instalar desde archivo. Suben las cinco skills de una vez.</w:t>
+        <w:t xml:space="preserve"> En GitHub, el botón verde «Code» y «Download ZIP», sin necesidad de cuenta. Descomprime, entra en la carpeta plugins, comprime la carpeta irem (clic derecho, «Comprimir») y sube ese .zip en Customize &gt; Plugins, con la opción de instalar desde archivo. Suben las seis skills de una vez.</w:t>
       </w:r>
     </w:p>
     <w:p>
@@ -1330,6 +1397,7 @@
           <w:tcPr>
             <w:tcW w:w="3326" w:type="dxa"/>
             <w:shd w:val="clear" w:color="auto" w:fill="D9D9D9"/>
+            <w:vAlign w:val="center"/>
           </w:tcPr>
           <w:p>
             <w:pPr>
@@ -1364,6 +1432,7 @@
           <w:tcPr>
             <w:tcW w:w="6458" w:type="dxa"/>
             <w:shd w:val="clear" w:color="auto" w:fill="D9D9D9"/>
+            <w:vAlign w:val="center"/>
           </w:tcPr>
           <w:p>
             <w:pPr>
@@ -1408,7 +1477,7 @@
             <w:pPr>
               <w:pStyle w:val="ListParagraph"/>
               <w:ind w:left="0"/>
-              <w:jc w:val="both"/>
+              <w:jc w:val="left"/>
               <w:rPr>
                 <w:rFonts w:ascii="Calibri" w:hAnsi="Calibri" w:cs="Calibri"/>
                 <w:color w:val="000000"/>
@@ -1473,7 +1542,7 @@
             <w:pPr>
               <w:pStyle w:val="ListParagraph"/>
               <w:ind w:left="0"/>
-              <w:jc w:val="both"/>
+              <w:jc w:val="left"/>
               <w:rPr>
                 <w:rFonts w:ascii="Calibri" w:hAnsi="Calibri" w:cs="Calibri"/>
                 <w:color w:val="000000"/>
@@ -1538,7 +1607,7 @@
             <w:pPr>
               <w:pStyle w:val="ListParagraph"/>
               <w:ind w:left="0"/>
-              <w:jc w:val="both"/>
+              <w:jc w:val="left"/>
               <w:rPr>
                 <w:rFonts w:ascii="Calibri" w:hAnsi="Calibri" w:cs="Calibri"/>
                 <w:color w:val="000000"/>
@@ -1603,7 +1672,7 @@
             <w:pPr>
               <w:pStyle w:val="ListParagraph"/>
               <w:ind w:left="0"/>
-              <w:jc w:val="both"/>
+              <w:jc w:val="left"/>
               <w:rPr>
                 <w:rFonts w:ascii="Calibri" w:hAnsi="Calibri" w:cs="Calibri"/>
                 <w:color w:val="000000"/>
@@ -1729,7 +1798,7 @@
           <w:szCs w:val="24"/>
           <w:lang w:val="es-419"/>
         </w:rPr>
-        <w:t xml:space="preserve">Cómo se actualizan</w:t>
+        <w:t xml:space="preserve">Cómo se actualizan cuando ya las tienes instaladas</w:t>
       </w:r>
     </w:p>
     <w:p>
@@ -1747,11 +1816,22 @@
       <w:r>
         <w:rPr>
           <w:rFonts w:ascii="Calibri" w:hAnsi="Calibri" w:cs="Calibri"/>
-          <w:sz w:val="24"/>
-          <w:szCs w:val="24"/>
-          <w:lang w:val="es-419"/>
-        </w:rPr>
-        <w:t xml:space="preserve">Con /plugin update irem, y otra vez sesión nueva.</w:t>
+          <w:b/>
+          <w:bCs/>
+          <w:sz w:val="24"/>
+          <w:szCs w:val="24"/>
+          <w:lang w:val="es-419"/>
+        </w:rPr>
+        <w:t xml:space="preserve">No se actualizan solas.</w:t>
+      </w:r>
+      <w:r>
+        <w:rPr>
+          <w:rFonts w:ascii="Calibri" w:hAnsi="Calibri" w:cs="Calibri"/>
+          <w:sz w:val="24"/>
+          <w:szCs w:val="24"/>
+          <w:lang w:val="es-419"/>
+        </w:rPr>
+        <w:t xml:space="preserve"> Ni en Claude Code ni en Cowork hay actualización automática de plugins: hasta que corras la actualización sigues con la versión que instalaste, y no hay ningún aviso de que salió una nueva. Por eso, cuando el cambio importa, se avisa por el canal del equipo.</w:t>
       </w:r>
     </w:p>
     <w:p>
@@ -1779,22 +1859,83 @@
       <w:r>
         <w:rPr>
           <w:rFonts w:ascii="Calibri" w:hAnsi="Calibri" w:cs="Calibri"/>
+          <w:sz w:val="24"/>
+          <w:szCs w:val="24"/>
+          <w:lang w:val="es-419"/>
+        </w:rPr>
+        <w:t xml:space="preserve">En </w:t>
+      </w:r>
+      <w:r>
+        <w:rPr>
+          <w:rFonts w:ascii="Calibri" w:hAnsi="Calibri" w:cs="Calibri"/>
           <w:b/>
           <w:bCs/>
           <w:sz w:val="24"/>
           <w:szCs w:val="24"/>
           <w:lang w:val="es-419"/>
         </w:rPr>
-        <w:t xml:space="preserve">Nadie se entera solo de que hay una versión nueva.</w:t>
-      </w:r>
-      <w:r>
-        <w:rPr>
-          <w:rFonts w:ascii="Calibri" w:hAnsi="Calibri" w:cs="Calibri"/>
-          <w:sz w:val="24"/>
-          <w:szCs w:val="24"/>
-          <w:lang w:val="es-419"/>
-        </w:rPr>
-        <w:t xml:space="preserve"> Hasta que corran ese comando siguen con la que tienen, así que cuando el cambio importe hay que avisar por el canal del equipo.</w:t>
+        <w:t xml:space="preserve">Claude Code</w:t>
+      </w:r>
+      <w:r>
+        <w:rPr>
+          <w:rFonts w:ascii="Calibri" w:hAnsi="Calibri" w:cs="Calibri"/>
+          <w:sz w:val="24"/>
+          <w:szCs w:val="24"/>
+          <w:lang w:val="es-419"/>
+        </w:rPr>
+        <w:t xml:space="preserve">, con /plugin update irem, y otra vez sesión nueva. Para saber en qué versión estás, el comando claude plugin list en la terminal, o /plugin y mirar la línea irem@rmei-digital. Si responde que ya estás al día justo después de que se publicó algo, el marketplace local todavía no trajo el cambio: corre /plugin marketplace update rmei-digital y repite el update.</w:t>
+      </w:r>
+    </w:p>
+    <w:p>
+      <w:pPr>
+        <w:rPr>
+          <w:rFonts w:ascii="Calibri" w:hAnsi="Calibri" w:cs="Calibri"/>
+          <w:sz w:val="24"/>
+          <w:szCs w:val="24"/>
+          <w:lang w:val="es-419"/>
+        </w:rPr>
+      </w:pPr>
+    </w:p>
+    <w:p>
+      <w:pPr>
+        <w:pStyle w:val="NormalWeb"/>
+        <w:spacing w:before="0" w:beforeAutospacing="0" w:after="0" w:afterAutospacing="0"/>
+        <w:jc w:val="both"/>
+        <w:rPr>
+          <w:rFonts w:ascii="Calibri" w:hAnsi="Calibri" w:cs="Calibri"/>
+          <w:sz w:val="24"/>
+          <w:szCs w:val="24"/>
+          <w:lang w:val="es-419"/>
+        </w:rPr>
+      </w:pPr>
+      <w:r>
+        <w:rPr>
+          <w:rFonts w:ascii="Calibri" w:hAnsi="Calibri" w:cs="Calibri"/>
+          <w:sz w:val="24"/>
+          <w:szCs w:val="24"/>
+          <w:lang w:val="es-419"/>
+        </w:rPr>
+        <w:t xml:space="preserve">En </w:t>
+      </w:r>
+      <w:r>
+        <w:rPr>
+          <w:rFonts w:ascii="Calibri" w:hAnsi="Calibri" w:cs="Calibri"/>
+          <w:b/>
+          <w:bCs/>
+          <w:sz w:val="24"/>
+          <w:szCs w:val="24"/>
+          <w:lang w:val="es-419"/>
+        </w:rPr>
+        <w:t xml:space="preserve">Claude Cowork</w:t>
+      </w:r>
+      <w:r>
+        <w:rPr>
+          <w:rFonts w:ascii="Calibri" w:hAnsi="Calibri" w:cs="Calibri"/>
+          <w:sz w:val="24"/>
+          <w:szCs w:val="24"/>
+          <w:lang w:val="es-419"/>
+        </w:rPr>
+        <w:t xml:space="preserve">, en Customize &gt; Plugins, el botón «Update» del marketplace RMEI-digital/claude-skills. Si lo instalaste subiendo un .zip (los caminos 2 y 3 de arriba), no hay botón: hay que volver a bajar el repositorio y subirlo otra vez.</w:t>
       </w:r>
     </w:p>
     <w:p>
@@ -1816,7 +1957,7 @@
           <w:numId w:val="53"/>
         </w:numPr>
         <w:spacing w:before="0" w:beforeAutospacing="0" w:after="0" w:afterAutospacing="0"/>
-        <w:ind w:left="540" w:hanging="270"/>
+        <w:ind w:left="0" w:hanging="0"/>
         <w:rPr>
           <w:rFonts w:ascii="Calibri" w:hAnsi="Calibri" w:cs="Calibri"/>
           <w:b/>
@@ -1835,7 +1976,7 @@
           <w:szCs w:val="24"/>
           <w:lang w:val="es-419"/>
         </w:rPr>
-        <w:t xml:space="preserve">Informes de misión: /irem-mision-informe</w:t>
+        <w:t xml:space="preserve">Agendas de misión: /irem-mision-agenda</w:t>
       </w:r>
     </w:p>
     <w:p>
@@ -1857,7 +1998,7 @@
           <w:szCs w:val="24"/>
           <w:lang w:val="es-419"/>
         </w:rPr>
-        <w:t xml:space="preserve">Convierte el material crudo de una misión (transcripciones, apuntes, correos) en el informe completo, con la estructura de siempre: cada actor contado según el ciclo de vida del dato, y los desafíos agrupados por esas mismas etapas.</w:t>
+        <w:t xml:space="preserve">Redacta la agenda de una misión completa: antecedentes, objetivo general, objetivos específicos, productos esperados, metodología, participantes, la tabla día por día, y los requerimientos técnicos y de movilidad. Cubre los tres tipos de misión del equipo (definición de alcance, capacitación, y monitoreo y acompañamiento) y añade sola las secciones propias de cada uno.</w:t>
       </w:r>
     </w:p>
     <w:p>
@@ -1885,6 +2026,38 @@
       <w:r>
         <w:rPr>
           <w:rFonts w:ascii="Calibri" w:hAnsi="Calibri" w:cs="Calibri"/>
+          <w:sz w:val="24"/>
+          <w:szCs w:val="24"/>
+          <w:lang w:val="es-419"/>
+        </w:rPr>
+        <w:t xml:space="preserve">Una agenda no es un cronograma: es el documento con el que la contraparte compromete a su gente y con el que después se juzga si la misión hizo lo que dijo que iba a hacer. Por eso lleva objetivos y metodología, y no solo la tabla de horas.</w:t>
+      </w:r>
+    </w:p>
+    <w:p>
+      <w:pPr>
+        <w:rPr>
+          <w:rFonts w:ascii="Calibri" w:hAnsi="Calibri" w:cs="Calibri"/>
+          <w:sz w:val="24"/>
+          <w:szCs w:val="24"/>
+          <w:lang w:val="es-419"/>
+        </w:rPr>
+      </w:pPr>
+    </w:p>
+    <w:p>
+      <w:pPr>
+        <w:pStyle w:val="NormalWeb"/>
+        <w:spacing w:before="0" w:beforeAutospacing="0" w:after="0" w:afterAutospacing="0"/>
+        <w:jc w:val="both"/>
+        <w:rPr>
+          <w:rFonts w:ascii="Calibri" w:hAnsi="Calibri" w:cs="Calibri"/>
+          <w:sz w:val="24"/>
+          <w:szCs w:val="24"/>
+          <w:lang w:val="es-419"/>
+        </w:rPr>
+      </w:pPr>
+      <w:r>
+        <w:rPr>
+          <w:rFonts w:ascii="Calibri" w:hAnsi="Calibri" w:cs="Calibri"/>
           <w:b/>
           <w:bCs/>
           <w:sz w:val="24"/>
@@ -1900,7 +2073,7 @@
           <w:szCs w:val="24"/>
           <w:lang w:val="es-419"/>
         </w:rPr>
-        <w:t xml:space="preserve"> Si un dato falta, lo pregunta o lo deja marcado como pendiente, pero no escribe algo plausible. Y distingue lo observado de lo dicho.</w:t>
+        <w:t xml:space="preserve"> Lo que no está confirmado va como «Por confirmar», y te avisa de qué quedó así para que lo cierres antes de enviarlo a la contraparte.</w:t>
       </w:r>
     </w:p>
     <w:p>
@@ -1959,7 +2132,7 @@
           <w:szCs w:val="24"/>
           <w:lang w:val="es-419"/>
         </w:rPr>
-        <w:t xml:space="preserve">«Hazme el informe de la misión a Quibdó, aquí están mis notas.»</w:t>
+        <w:t xml:space="preserve">«Hazme la agenda de la misión a Honduras.»</w:t>
       </w:r>
     </w:p>
     <w:p>
@@ -1984,7 +2157,32 @@
           <w:szCs w:val="24"/>
           <w:lang w:val="es-419"/>
         </w:rPr>
-        <w:t xml:space="preserve">«Pásame esta transcripción a informe de misión.»</w:t>
+        <w:t xml:space="preserve">«Convierte estas notas en el borrador de agenda.»</w:t>
+      </w:r>
+    </w:p>
+    <w:p>
+      <w:pPr>
+        <w:pStyle w:val="ListParagraph"/>
+        <w:numPr>
+          <w:ilvl w:val="0"/>
+          <w:numId w:val="36"/>
+        </w:numPr>
+        <w:jc w:val="both"/>
+        <w:rPr>
+          <w:rFonts w:ascii="Calibri" w:hAnsi="Calibri" w:cs="Calibri"/>
+          <w:sz w:val="24"/>
+          <w:szCs w:val="24"/>
+          <w:lang w:val="es-419"/>
+        </w:rPr>
+      </w:pPr>
+      <w:r>
+        <w:rPr>
+          <w:rFonts w:ascii="Calibri" w:hAnsi="Calibri" w:cs="Calibri"/>
+          <w:sz w:val="24"/>
+          <w:szCs w:val="24"/>
+          <w:lang w:val="es-419"/>
+        </w:rPr>
+        <w:t xml:space="preserve">«Agenda de la capacitación de facilitadores.»</w:t>
       </w:r>
     </w:p>
     <w:p>
@@ -2040,7 +2238,7 @@
           <w:szCs w:val="24"/>
           <w:lang w:val="es-419"/>
         </w:rPr>
-        <w:t xml:space="preserve">Primero lee todo y te enseña qué encontró. Después pregunta solo por los huecos, en un mensaje: fechas, lugar y participantes; el oficio que originó la misión; las etapas del ciclo de las que no hay información; y si hubo reunión de cierre.</w:t>
+        <w:t xml:space="preserve">De qué tipo es la misión, si el material no lo aclara. Después, los huecos en un solo mensaje: fechas, ciudades y sedes, qué instituciones participan y con qué unidades, quién va por la IREM, el disparador de la misión y qué se hace cada día.</w:t>
       </w:r>
     </w:p>
     <w:p>
@@ -2096,7 +2294,7 @@
           <w:szCs w:val="24"/>
           <w:lang w:val="es-419"/>
         </w:rPr>
-        <w:t xml:space="preserve">El informe en Word, listo para enviar, y su contenido en texto plano. Los dos a propósito: corregir el texto es barato y recompilar el Word cuesta un comando.</w:t>
+        <w:t xml:space="preserve">La agenda en Word, su contenido en texto plano y la lista de lo que quedó como «Por confirmar». Antes de compilar pasa un verificador que revisa estructura y redacción: objetivos que no empiezan en infinitivo, metodología en viñetas, horas en am/pm, días sin tabla.</w:t>
       </w:r>
     </w:p>
     <w:p>
@@ -2118,7 +2316,7 @@
           <w:numId w:val="53"/>
         </w:numPr>
         <w:spacing w:before="0" w:beforeAutospacing="0" w:after="0" w:afterAutospacing="0"/>
-        <w:ind w:left="540" w:hanging="270"/>
+        <w:ind w:left="0" w:hanging="0"/>
         <w:rPr>
           <w:rFonts w:ascii="Calibri" w:hAnsi="Calibri" w:cs="Calibri"/>
           <w:b/>
@@ -2137,7 +2335,7 @@
           <w:szCs w:val="24"/>
           <w:lang w:val="es-419"/>
         </w:rPr>
-        <w:t xml:space="preserve">Documentos Word: /irem-word-formato</w:t>
+        <w:t xml:space="preserve">Informes de misión: /irem-mision-informe</w:t>
       </w:r>
     </w:p>
     <w:p>
@@ -2159,7 +2357,7 @@
           <w:szCs w:val="24"/>
           <w:lang w:val="es-419"/>
         </w:rPr>
-        <w:t xml:space="preserve">Da a un documento de Word el formato institucional completo: logos del BID y de mesoamérica MALARIA en el encabezado, Calibri 12 justificado, secciones numeradas en romanos, viñetas y tablas de encabezado gris.</w:t>
+        <w:t xml:space="preserve">Convierte el material crudo de una misión (transcripciones, apuntes, correos) en el informe completo, con la estructura de siempre: cada actor contado según el ciclo de vida del dato, y los desafíos agrupados por esas mismas etapas.</w:t>
       </w:r>
     </w:p>
     <w:p>
@@ -2187,51 +2385,22 @@
       <w:r>
         <w:rPr>
           <w:rFonts w:ascii="Calibri" w:hAnsi="Calibri" w:cs="Calibri"/>
-          <w:sz w:val="24"/>
-          <w:szCs w:val="24"/>
-          <w:lang w:val="es-419"/>
-        </w:rPr>
-        <w:t xml:space="preserve">Sirve para </w:t>
-      </w:r>
-      <w:r>
-        <w:rPr>
-          <w:rFonts w:ascii="Calibri" w:hAnsi="Calibri" w:cs="Calibri"/>
           <w:b/>
           <w:bCs/>
           <w:sz w:val="24"/>
           <w:szCs w:val="24"/>
           <w:lang w:val="es-419"/>
         </w:rPr>
-        <w:t xml:space="preserve">formatear</w:t>
-      </w:r>
-      <w:r>
-        <w:rPr>
-          <w:rFonts w:ascii="Calibri" w:hAnsi="Calibri" w:cs="Calibri"/>
-          <w:sz w:val="24"/>
-          <w:szCs w:val="24"/>
-          <w:lang w:val="es-419"/>
-        </w:rPr>
-        <w:t xml:space="preserve"> un documento que ya existe y para </w:t>
-      </w:r>
-      <w:r>
-        <w:rPr>
-          <w:rFonts w:ascii="Calibri" w:hAnsi="Calibri" w:cs="Calibri"/>
-          <w:b/>
-          <w:bCs/>
-          <w:sz w:val="24"/>
-          <w:szCs w:val="24"/>
-          <w:lang w:val="es-419"/>
-        </w:rPr>
-        <w:t xml:space="preserve">generar</w:t>
-      </w:r>
-      <w:r>
-        <w:rPr>
-          <w:rFonts w:ascii="Calibri" w:hAnsi="Calibri" w:cs="Calibri"/>
-          <w:sz w:val="24"/>
-          <w:szCs w:val="24"/>
-          <w:lang w:val="es-419"/>
-        </w:rPr>
-        <w:t xml:space="preserve"> uno nuevo desde texto. La usa la skill de informes en su último paso, pero vale sola para cualquier nota o memorando.</w:t>
+        <w:t xml:space="preserve">Nunca inventa contenido.</w:t>
+      </w:r>
+      <w:r>
+        <w:rPr>
+          <w:rFonts w:ascii="Calibri" w:hAnsi="Calibri" w:cs="Calibri"/>
+          <w:sz w:val="24"/>
+          <w:szCs w:val="24"/>
+          <w:lang w:val="es-419"/>
+        </w:rPr>
+        <w:t xml:space="preserve"> Si un dato falta, lo pregunta o lo deja marcado como pendiente, pero no escribe algo plausible. Y distingue lo observado de lo dicho.</w:t>
       </w:r>
     </w:p>
     <w:p>
@@ -2290,7 +2459,7 @@
           <w:szCs w:val="24"/>
           <w:lang w:val="es-419"/>
         </w:rPr>
-        <w:t xml:space="preserve">«Dale el formato institucional a este Word.»</w:t>
+        <w:t xml:space="preserve">«Hazme el informe de la misión a Quibdó, aquí están mis notas.»</w:t>
       </w:r>
     </w:p>
     <w:p>
@@ -2315,7 +2484,7 @@
           <w:szCs w:val="24"/>
           <w:lang w:val="es-419"/>
         </w:rPr>
-        <w:t xml:space="preserve">«Pasa estas notas a Word con el formato de la casa.»</w:t>
+        <w:t xml:space="preserve">«Pásame esta transcripción a informe de misión.»</w:t>
       </w:r>
     </w:p>
     <w:p>
@@ -2371,7 +2540,7 @@
           <w:szCs w:val="24"/>
           <w:lang w:val="es-419"/>
         </w:rPr>
-        <w:t xml:space="preserve">Casi nada: es la menos conversacional. Si le das texto suelto, propone qué línea es sección, cuál subtítulo y cuál viñeta antes de compilar.</w:t>
+        <w:t xml:space="preserve">Primero lee todo y te enseña qué encontró. Después pregunta solo por los huecos, en un mensaje: fechas, lugar y participantes; el oficio que originó la misión; las etapas del ciclo de las que no hay información; y si hubo reunión de cierre.</w:t>
       </w:r>
     </w:p>
     <w:p>
@@ -2427,7 +2596,7 @@
           <w:szCs w:val="24"/>
           <w:lang w:val="es-419"/>
         </w:rPr>
-        <w:t xml:space="preserve">El documento formateado, sin tocar el original, y el recuento de bloques de cada tipo que encontró. Vale la pena mirarlo: cero secciones en un documento que sí tiene capítulos delata una clasificación mala.</w:t>
+        <w:t xml:space="preserve">El informe en Word, listo para enviar, y su contenido en texto plano. Los dos a propósito: corregir el texto es barato y recompilar el Word cuesta un comando.</w:t>
       </w:r>
     </w:p>
     <w:p>
@@ -2449,7 +2618,338 @@
           <w:numId w:val="53"/>
         </w:numPr>
         <w:spacing w:before="0" w:beforeAutospacing="0" w:after="0" w:afterAutospacing="0"/>
-        <w:ind w:left="540" w:hanging="270"/>
+        <w:ind w:left="0" w:hanging="0"/>
+        <w:rPr>
+          <w:rFonts w:ascii="Calibri" w:hAnsi="Calibri" w:cs="Calibri"/>
+          <w:b/>
+          <w:bCs/>
+          <w:sz w:val="24"/>
+          <w:szCs w:val="24"/>
+          <w:lang w:val="es-419"/>
+        </w:rPr>
+      </w:pPr>
+      <w:r>
+        <w:rPr>
+          <w:rFonts w:ascii="Calibri" w:hAnsi="Calibri" w:cs="Calibri"/>
+          <w:b/>
+          <w:bCs/>
+          <w:sz w:val="24"/>
+          <w:szCs w:val="24"/>
+          <w:lang w:val="es-419"/>
+        </w:rPr>
+        <w:t xml:space="preserve">Documentos Word: /irem-word-formato</w:t>
+      </w:r>
+    </w:p>
+    <w:p>
+      <w:pPr>
+        <w:pStyle w:val="NormalWeb"/>
+        <w:spacing w:before="0" w:beforeAutospacing="0" w:after="0" w:afterAutospacing="0"/>
+        <w:jc w:val="both"/>
+        <w:rPr>
+          <w:rFonts w:ascii="Calibri" w:hAnsi="Calibri" w:cs="Calibri"/>
+          <w:sz w:val="24"/>
+          <w:szCs w:val="24"/>
+          <w:lang w:val="es-419"/>
+        </w:rPr>
+      </w:pPr>
+      <w:r>
+        <w:rPr>
+          <w:rFonts w:ascii="Calibri" w:hAnsi="Calibri" w:cs="Calibri"/>
+          <w:sz w:val="24"/>
+          <w:szCs w:val="24"/>
+          <w:lang w:val="es-419"/>
+        </w:rPr>
+        <w:t xml:space="preserve">Da a un documento de Word el formato institucional completo: logos del BID y de mesoamérica MALARIA en el encabezado, Calibri 12 justificado, secciones numeradas en romanos, viñetas y tablas de encabezado gris.</w:t>
+      </w:r>
+    </w:p>
+    <w:p>
+      <w:pPr>
+        <w:rPr>
+          <w:rFonts w:ascii="Calibri" w:hAnsi="Calibri" w:cs="Calibri"/>
+          <w:sz w:val="24"/>
+          <w:szCs w:val="24"/>
+          <w:lang w:val="es-419"/>
+        </w:rPr>
+      </w:pPr>
+    </w:p>
+    <w:p>
+      <w:pPr>
+        <w:pStyle w:val="NormalWeb"/>
+        <w:spacing w:before="0" w:beforeAutospacing="0" w:after="0" w:afterAutospacing="0"/>
+        <w:jc w:val="both"/>
+        <w:rPr>
+          <w:rFonts w:ascii="Calibri" w:hAnsi="Calibri" w:cs="Calibri"/>
+          <w:sz w:val="24"/>
+          <w:szCs w:val="24"/>
+          <w:lang w:val="es-419"/>
+        </w:rPr>
+      </w:pPr>
+      <w:r>
+        <w:rPr>
+          <w:rFonts w:ascii="Calibri" w:hAnsi="Calibri" w:cs="Calibri"/>
+          <w:sz w:val="24"/>
+          <w:szCs w:val="24"/>
+          <w:lang w:val="es-419"/>
+        </w:rPr>
+        <w:t xml:space="preserve">Sirve para </w:t>
+      </w:r>
+      <w:r>
+        <w:rPr>
+          <w:rFonts w:ascii="Calibri" w:hAnsi="Calibri" w:cs="Calibri"/>
+          <w:b/>
+          <w:bCs/>
+          <w:sz w:val="24"/>
+          <w:szCs w:val="24"/>
+          <w:lang w:val="es-419"/>
+        </w:rPr>
+        <w:t xml:space="preserve">formatear</w:t>
+      </w:r>
+      <w:r>
+        <w:rPr>
+          <w:rFonts w:ascii="Calibri" w:hAnsi="Calibri" w:cs="Calibri"/>
+          <w:sz w:val="24"/>
+          <w:szCs w:val="24"/>
+          <w:lang w:val="es-419"/>
+        </w:rPr>
+        <w:t xml:space="preserve"> un documento que ya existe y para </w:t>
+      </w:r>
+      <w:r>
+        <w:rPr>
+          <w:rFonts w:ascii="Calibri" w:hAnsi="Calibri" w:cs="Calibri"/>
+          <w:b/>
+          <w:bCs/>
+          <w:sz w:val="24"/>
+          <w:szCs w:val="24"/>
+          <w:lang w:val="es-419"/>
+        </w:rPr>
+        <w:t xml:space="preserve">generar</w:t>
+      </w:r>
+      <w:r>
+        <w:rPr>
+          <w:rFonts w:ascii="Calibri" w:hAnsi="Calibri" w:cs="Calibri"/>
+          <w:sz w:val="24"/>
+          <w:szCs w:val="24"/>
+          <w:lang w:val="es-419"/>
+        </w:rPr>
+        <w:t xml:space="preserve"> uno nuevo desde texto. La usa la skill de informes en su último paso, pero vale sola para cualquier nota o memorando.</w:t>
+      </w:r>
+    </w:p>
+    <w:p>
+      <w:pPr>
+        <w:rPr>
+          <w:rFonts w:ascii="Calibri" w:hAnsi="Calibri" w:cs="Calibri"/>
+          <w:sz w:val="24"/>
+          <w:szCs w:val="24"/>
+          <w:lang w:val="es-419"/>
+        </w:rPr>
+      </w:pPr>
+    </w:p>
+    <w:p>
+      <w:pPr>
+        <w:keepNext/>
+        <w:rPr>
+          <w:rFonts w:ascii="Calibri" w:hAnsi="Calibri" w:cs="Calibri"/>
+          <w:b/>
+          <w:bCs/>
+          <w:sz w:val="24"/>
+          <w:szCs w:val="24"/>
+          <w:lang w:val="es-419"/>
+        </w:rPr>
+      </w:pPr>
+      <w:r>
+        <w:rPr>
+          <w:rFonts w:ascii="Calibri" w:hAnsi="Calibri" w:cs="Calibri"/>
+          <w:b/>
+          <w:bCs/>
+          <w:sz w:val="24"/>
+          <w:szCs w:val="24"/>
+          <w:lang w:val="es-419"/>
+        </w:rPr>
+        <w:t xml:space="preserve">Se lo pides así</w:t>
+      </w:r>
+    </w:p>
+    <w:p>
+      <w:pPr>
+        <w:pStyle w:val="ListParagraph"/>
+        <w:numPr>
+          <w:ilvl w:val="0"/>
+          <w:numId w:val="36"/>
+        </w:numPr>
+        <w:jc w:val="both"/>
+        <w:rPr>
+          <w:rFonts w:ascii="Calibri" w:hAnsi="Calibri" w:cs="Calibri"/>
+          <w:sz w:val="24"/>
+          <w:szCs w:val="24"/>
+          <w:lang w:val="es-419"/>
+        </w:rPr>
+      </w:pPr>
+      <w:r>
+        <w:rPr>
+          <w:rFonts w:ascii="Calibri" w:hAnsi="Calibri" w:cs="Calibri"/>
+          <w:sz w:val="24"/>
+          <w:szCs w:val="24"/>
+          <w:lang w:val="es-419"/>
+        </w:rPr>
+        <w:t xml:space="preserve">«Dale el formato institucional a este Word.»</w:t>
+      </w:r>
+    </w:p>
+    <w:p>
+      <w:pPr>
+        <w:pStyle w:val="ListParagraph"/>
+        <w:numPr>
+          <w:ilvl w:val="0"/>
+          <w:numId w:val="36"/>
+        </w:numPr>
+        <w:jc w:val="both"/>
+        <w:rPr>
+          <w:rFonts w:ascii="Calibri" w:hAnsi="Calibri" w:cs="Calibri"/>
+          <w:sz w:val="24"/>
+          <w:szCs w:val="24"/>
+          <w:lang w:val="es-419"/>
+        </w:rPr>
+      </w:pPr>
+      <w:r>
+        <w:rPr>
+          <w:rFonts w:ascii="Calibri" w:hAnsi="Calibri" w:cs="Calibri"/>
+          <w:sz w:val="24"/>
+          <w:szCs w:val="24"/>
+          <w:lang w:val="es-419"/>
+        </w:rPr>
+        <w:t xml:space="preserve">«Pasa estas notas a Word con el formato de la casa.»</w:t>
+      </w:r>
+    </w:p>
+    <w:p>
+      <w:pPr>
+        <w:rPr>
+          <w:rFonts w:ascii="Calibri" w:hAnsi="Calibri" w:cs="Calibri"/>
+          <w:sz w:val="24"/>
+          <w:szCs w:val="24"/>
+          <w:lang w:val="es-419"/>
+        </w:rPr>
+      </w:pPr>
+    </w:p>
+    <w:p>
+      <w:pPr>
+        <w:keepNext/>
+        <w:rPr>
+          <w:rFonts w:ascii="Calibri" w:hAnsi="Calibri" w:cs="Calibri"/>
+          <w:b/>
+          <w:bCs/>
+          <w:sz w:val="24"/>
+          <w:szCs w:val="24"/>
+          <w:lang w:val="es-419"/>
+        </w:rPr>
+      </w:pPr>
+      <w:r>
+        <w:rPr>
+          <w:rFonts w:ascii="Calibri" w:hAnsi="Calibri" w:cs="Calibri"/>
+          <w:b/>
+          <w:bCs/>
+          <w:sz w:val="24"/>
+          <w:szCs w:val="24"/>
+          <w:lang w:val="es-419"/>
+        </w:rPr>
+        <w:t xml:space="preserve">Te va a preguntar</w:t>
+      </w:r>
+    </w:p>
+    <w:p>
+      <w:pPr>
+        <w:pStyle w:val="NormalWeb"/>
+        <w:spacing w:before="0" w:beforeAutospacing="0" w:after="0" w:afterAutospacing="0"/>
+        <w:jc w:val="both"/>
+        <w:rPr>
+          <w:rFonts w:ascii="Calibri" w:hAnsi="Calibri" w:cs="Calibri"/>
+          <w:sz w:val="24"/>
+          <w:szCs w:val="24"/>
+          <w:lang w:val="es-419"/>
+        </w:rPr>
+      </w:pPr>
+      <w:r>
+        <w:rPr>
+          <w:rFonts w:ascii="Calibri" w:hAnsi="Calibri" w:cs="Calibri"/>
+          <w:sz w:val="24"/>
+          <w:szCs w:val="24"/>
+          <w:lang w:val="es-419"/>
+        </w:rPr>
+        <w:t xml:space="preserve">Casi nada: es la menos conversacional. Si le das texto suelto, propone qué línea es sección, cuál subtítulo y cuál viñeta antes de compilar.</w:t>
+      </w:r>
+    </w:p>
+    <w:p>
+      <w:pPr>
+        <w:rPr>
+          <w:rFonts w:ascii="Calibri" w:hAnsi="Calibri" w:cs="Calibri"/>
+          <w:sz w:val="24"/>
+          <w:szCs w:val="24"/>
+          <w:lang w:val="es-419"/>
+        </w:rPr>
+      </w:pPr>
+    </w:p>
+    <w:p>
+      <w:pPr>
+        <w:keepNext/>
+        <w:rPr>
+          <w:rFonts w:ascii="Calibri" w:hAnsi="Calibri" w:cs="Calibri"/>
+          <w:b/>
+          <w:bCs/>
+          <w:sz w:val="24"/>
+          <w:szCs w:val="24"/>
+          <w:lang w:val="es-419"/>
+        </w:rPr>
+      </w:pPr>
+      <w:r>
+        <w:rPr>
+          <w:rFonts w:ascii="Calibri" w:hAnsi="Calibri" w:cs="Calibri"/>
+          <w:b/>
+          <w:bCs/>
+          <w:sz w:val="24"/>
+          <w:szCs w:val="24"/>
+          <w:lang w:val="es-419"/>
+        </w:rPr>
+        <w:t xml:space="preserve">Recibes</w:t>
+      </w:r>
+    </w:p>
+    <w:p>
+      <w:pPr>
+        <w:pStyle w:val="NormalWeb"/>
+        <w:spacing w:before="0" w:beforeAutospacing="0" w:after="0" w:afterAutospacing="0"/>
+        <w:jc w:val="both"/>
+        <w:rPr>
+          <w:rFonts w:ascii="Calibri" w:hAnsi="Calibri" w:cs="Calibri"/>
+          <w:sz w:val="24"/>
+          <w:szCs w:val="24"/>
+          <w:lang w:val="es-419"/>
+        </w:rPr>
+      </w:pPr>
+      <w:r>
+        <w:rPr>
+          <w:rFonts w:ascii="Calibri" w:hAnsi="Calibri" w:cs="Calibri"/>
+          <w:sz w:val="24"/>
+          <w:szCs w:val="24"/>
+          <w:lang w:val="es-419"/>
+        </w:rPr>
+        <w:t xml:space="preserve">El documento formateado, sin tocar el original, y el recuento de bloques de cada tipo que encontró. Vale la pena mirarlo: cero secciones en un documento que sí tiene capítulos delata una clasificación mala.</w:t>
+      </w:r>
+    </w:p>
+    <w:p>
+      <w:pPr>
+        <w:rPr>
+          <w:rFonts w:ascii="Calibri" w:hAnsi="Calibri" w:cs="Calibri"/>
+          <w:sz w:val="24"/>
+          <w:szCs w:val="24"/>
+          <w:lang w:val="es-419"/>
+        </w:rPr>
+      </w:pPr>
+    </w:p>
+    <w:p>
+      <w:pPr>
+        <w:keepNext/>
+        <w:pStyle w:val="NormalWeb"/>
+        <w:numPr>
+          <w:ilvl w:val="0"/>
+          <w:numId w:val="53"/>
+        </w:numPr>
+        <w:spacing w:before="0" w:beforeAutospacing="0" w:after="0" w:afterAutospacing="0"/>
+        <w:ind w:left="0" w:hanging="0"/>
         <w:rPr>
           <w:rFonts w:ascii="Calibri" w:hAnsi="Calibri" w:cs="Calibri"/>
           <w:b/>
@@ -2783,6 +3283,7 @@
           <w:tcPr>
             <w:tcW w:w="2935" w:type="dxa"/>
             <w:shd w:val="clear" w:color="auto" w:fill="D9D9D9"/>
+            <w:vAlign w:val="center"/>
           </w:tcPr>
           <w:p>
             <w:pPr>
@@ -2817,6 +3318,7 @@
           <w:tcPr>
             <w:tcW w:w="6849" w:type="dxa"/>
             <w:shd w:val="clear" w:color="auto" w:fill="D9D9D9"/>
+            <w:vAlign w:val="center"/>
           </w:tcPr>
           <w:p>
             <w:pPr>
@@ -2861,7 +3363,7 @@
             <w:pPr>
               <w:pStyle w:val="ListParagraph"/>
               <w:ind w:left="0"/>
-              <w:jc w:val="both"/>
+              <w:jc w:val="left"/>
               <w:rPr>
                 <w:rFonts w:ascii="Calibri" w:hAnsi="Calibri" w:cs="Calibri"/>
                 <w:color w:val="000000"/>
@@ -2926,7 +3428,7 @@
             <w:pPr>
               <w:pStyle w:val="ListParagraph"/>
               <w:ind w:left="0"/>
-              <w:jc w:val="both"/>
+              <w:jc w:val="left"/>
               <w:rPr>
                 <w:rFonts w:ascii="Calibri" w:hAnsi="Calibri" w:cs="Calibri"/>
                 <w:color w:val="000000"/>
@@ -2991,7 +3493,7 @@
             <w:pPr>
               <w:pStyle w:val="ListParagraph"/>
               <w:ind w:left="0"/>
-              <w:jc w:val="both"/>
+              <w:jc w:val="left"/>
               <w:rPr>
                 <w:rFonts w:ascii="Calibri" w:hAnsi="Calibri" w:cs="Calibri"/>
                 <w:color w:val="000000"/>
@@ -3136,7 +3638,7 @@
           <w:numId w:val="53"/>
         </w:numPr>
         <w:spacing w:before="0" w:beforeAutospacing="0" w:after="0" w:afterAutospacing="0"/>
-        <w:ind w:left="540" w:hanging="270"/>
+        <w:ind w:left="0" w:hanging="0"/>
         <w:rPr>
           <w:rFonts w:ascii="Calibri" w:hAnsi="Calibri" w:cs="Calibri"/>
           <w:b/>
@@ -3495,7 +3997,7 @@
           <w:numId w:val="53"/>
         </w:numPr>
         <w:spacing w:before="0" w:beforeAutospacing="0" w:after="0" w:afterAutospacing="0"/>
-        <w:ind w:left="540" w:hanging="270"/>
+        <w:ind w:left="0" w:hanging="0"/>
         <w:rPr>
           <w:rFonts w:ascii="Calibri" w:hAnsi="Calibri" w:cs="Calibri"/>
           <w:b/>
@@ -3866,7 +4368,7 @@
           <w:numId w:val="53"/>
         </w:numPr>
         <w:spacing w:before="0" w:beforeAutospacing="0" w:after="0" w:afterAutospacing="0"/>
-        <w:ind w:left="540" w:hanging="270"/>
+        <w:ind w:left="0" w:hanging="0"/>
         <w:rPr>
           <w:rFonts w:ascii="Calibri" w:hAnsi="Calibri" w:cs="Calibri"/>
           <w:b/>
@@ -3949,7 +4451,7 @@
           <w:numId w:val="53"/>
         </w:numPr>
         <w:spacing w:before="0" w:beforeAutospacing="0" w:after="0" w:afterAutospacing="0"/>
-        <w:ind w:left="540" w:hanging="270"/>
+        <w:ind w:left="0" w:hanging="0"/>
         <w:rPr>
           <w:rFonts w:ascii="Calibri" w:hAnsi="Calibri" w:cs="Calibri"/>
           <w:b/>
@@ -4300,10 +4802,11 @@
     <w:lvl w:ilvl="0" w:tplc="280A0013">
       <w:start w:val="1"/>
       <w:numFmt w:val="upperRoman"/>
+      <w:suff w:val="space"/>
       <w:lvlText w:val="%1."/>
-      <w:lvlJc w:val="right"/>
-      <w:pPr>
-        <w:ind w:left="720" w:hanging="360"/>
+      <w:lvlJc w:val="left"/>
+      <w:pPr>
+        <w:ind w:left="0" w:hanging="0"/>
       </w:pPr>
     </w:lvl>
     <w:lvl w:ilvl="1" w:tplc="280A0019" w:tentative="1">

</xml_diff>